<commit_message>
Schlusspruefung: Korrekturen gegen die Quellen
Automatisch nach dem Erstellen geprueft. Einzelheiten im Kommentar des Pull Requests.
</commit_message>
<xml_diff>
--- a/vorlagen/bedenkenanzeige-vob-b-musterschreiben/bedenkenanzeige-vob-b-musterschreiben.docx
+++ b/vorlagen/bedenkenanzeige-vob-b-musterschreiben/bedenkenanzeige-vob-b-musterschreiben.docx
@@ -1278,7 +1278,7 @@
           <w:color w:val="475262"/>
           <w:sz w:val="18"/>
         </w:rPr>
-        <w:t>• Eine einfache, nicht unterschriebene E-Mail kann die vereinbarte Schriftform verfehlen. Ein unterschriebener und eingescannter Brief genügt nach der Fachliteratur.</w:t>
+        <w:t>• Eine einfache, nicht unterschriebene E-Mail kann die vereinbarte Schriftform verfehlen. Ein unterschriebener und eingescannter Brief müsste nach der Fachliteratur genügen.</w:t>
       </w:r>
     </w:p>
     <w:p>
@@ -1338,7 +1338,7 @@
           <w:color w:val="475262"/>
           <w:sz w:val="18"/>
         </w:rPr>
-        <w:t>• Gegenüber Dritten, etwa späteren Mietern oder Erwerbern, schließt eine Bedenkenanzeige eine Haftung nicht aus.</w:t>
+        <w:t>• Gegenüber Dritten, etwa späteren Mietern, schließt eine Bedenkenanzeige eine Haftung nicht aus.</w:t>
       </w:r>
     </w:p>
     <w:p>
@@ -1362,7 +1362,7 @@
           <w:color w:val="475262"/>
           <w:sz w:val="16"/>
         </w:rPr>
-        <w:t>Grundlagen: § 3 Abs. 3, § 4 Abs. 1 Nr. 4, § 4 Abs. 3, § 6 Abs. 1 und § 13 Abs. 3 VOB/B, Ausgabe 2016; Wortlaut nach VOB-Gesamtausgabe 2019, S. 143, 145, 152 · Zanner: VOB/B nach Ansprüchen, 7. Aufl. 2021, S. 241–243 · Zanner/Glönkler: Baumangelhaftung nach Ansprüchen, 2. Aufl. 2024, S. 38 f. · Wirth/Pfisterer/Schellenberg: Privates Baurecht praxisnah, 3. Aufl. 2021, S. 127 · Weber/Hafkesbrink (Hrsg.): Bauwerksabdichtung in der Altbausanierung, 7. Aufl. 2026, S. 755 f. · Berner u. a.: Grundlagen der Baubetriebslehre 3, 3. Aufl. 2025, S. 139 f.</w:t>
+        <w:t>Grundlagen: § 3 Abs. 3, § 4 Abs. 1 Nr. 4, § 4 Abs. 3, § 6 Abs. 1 und § 13 Abs. 3 VOB/B, Ausgabe 2016; Wortlaut nach VOB-Gesamtausgabe 2019, S. 143, 145, 152 · Zanner: VOB/B nach Ansprüchen, 7. Aufl. 2021, S. 242–243 · Zanner/Glönkler: Baumangelhaftung nach Ansprüchen, 2. Aufl. 2024, S. 38 f. · Wirth/Pfisterer/Schellenberg: Privates Baurecht praxisnah, 3. Aufl. 2021, S. 127 · Weber/Hafkesbrink (Hrsg.): Bauwerksabdichtung in der Altbausanierung, 7. Aufl. 2026, S. 755 f. · Berner u. a.: Grundlagen der Baubetriebslehre 3, 3. Aufl. 2025, S. 139 f.</w:t>
       </w:r>
     </w:p>
     <w:p>

</xml_diff>

<commit_message>
Veröffentlichte Beiträge und Vorlagen redaktionell überarbeitet
Redaktionelle Überarbeitung nach der Regel für Fachbeiträge: Formulierungen
durchgehend in eigenen Worten, Wiedergaben von Regelwerken wie der VOB/B in
indirekter Rede, eine Wertetabelle durch einen Absatz mit den Eckwerten
ersetzt. Inhalt, Zahlen, Fristen, Paragrafen, Normausgaben und Fußnoten
bleiben gleich.

55 Fachbeiträge, 1 englischer Leitfaden, 10 Vorlagen (Downloads neu
gebaut), 3 LinkedIn-Entwürfe. tools/wortgleich_pruefen.py: 0 Treffer.

Co-Authored-By: Claude Opus 5.5 <noreply@anthropic.com>
</commit_message>
<xml_diff>
--- a/vorlagen/bedenkenanzeige-vob-b-musterschreiben/bedenkenanzeige-vob-b-musterschreiben.docx
+++ b/vorlagen/bedenkenanzeige-vob-b-musterschreiben/bedenkenanzeige-vob-b-musterschreiben.docx
@@ -36,7 +36,7 @@
           <w:color w:val="0F1A28"/>
           <w:sz w:val="21"/>
         </w:rPr>
-        <w:t>Mit diesem Musterschreiben melden Sie als Auftragnehmer Bedenken gegen die vorgesehene Art der Ausführung, gegen vom Auftraggeber gelieferte Stoffe oder Bauteile oder gegen die Vorleistung eines anderen Unternehmers an. Ersetzen Sie die Platzhalter in eckigen Klammern durch Ihre Angaben und streichen Sie, was nicht zutrifft. Die Prüfliste am Ende führt durch die Punkte, an denen Bedenkenanzeigen in der Praxis scheitern.</w:t>
+        <w:t>Mit diesem Musterschreiben melden Sie als Auftragnehmer Bedenken an. Sie können sich gegen die geplante Ausführungsweise richten, gegen Stoffe oder Bauteile, die der Auftraggeber geliefert hat, oder gegen die Vorleistung eines anderen Unternehmers. Ersetzen Sie die Platzhalter in eckigen Klammern durch Ihre Angaben und streichen Sie, was nicht zutrifft. Die Prüfliste am Ende führt durch die Punkte, an denen Bedenkenanzeigen in der Praxis scheitern.</w:t>
       </w:r>
     </w:p>
     <w:p>
@@ -122,7 +122,7 @@
           <w:color w:val="0F1A28"/>
           <w:sz w:val="21"/>
         </w:rPr>
-        <w:t>Unsere Bedenken betreffen [Zutreffendes wählen: die vorgesehene Art der Ausführung / die Güte der von Ihnen gelieferten oder vorgeschriebenen Stoffe oder Bauteile / die Leistung eines anderen Unternehmers als Vorleistung].</w:t>
+        <w:t>Unsere Bedenken richten sich gegen [Zutreffendes wählen: die geplante Ausführungsweise / die Beschaffenheit von Stoffen oder Bauteilen, die Sie geliefert oder vorgeschrieben haben / die Vorleistung eines anderen Unternehmers, auf der unsere Leistung aufbaut].</w:t>
       </w:r>
     </w:p>
     <w:p>
@@ -1218,7 +1218,7 @@
           <w:color w:val="475262"/>
           <w:sz w:val="18"/>
         </w:rPr>
-        <w:t>• § 4 Abs. 3 VOB/B verlangt die Mitteilung unverzüglich, möglichst schon vor Beginn der Arbeiten, schriftlich und gegenüber dem Auftraggeber.</w:t>
+        <w:t>• Nach § 4 Abs. 3 VOB/B muss die Mitteilung schriftlich an den Auftraggeber gehen, und zwar unverzüglich und nach Möglichkeit noch bevor die Arbeiten beginnen.</w:t>
       </w:r>
     </w:p>
     <w:p>
@@ -1290,7 +1290,7 @@
           <w:color w:val="475262"/>
           <w:sz w:val="18"/>
         </w:rPr>
-        <w:t>• Besteht der Auftraggeber nach der Bedenkenanzeige auf seiner Anordnung, ist sie auszuführen, wenn nicht gesetzliche oder behördliche Bestimmungen entgegenstehen.</w:t>
+        <w:t>• Hält der Auftraggeber trotz der Bedenkenanzeige an seiner Anordnung fest, muss sie ausgeführt werden; das gilt nicht, soweit gesetzliche oder behördliche Vorschriften dem entgegenstehen.</w:t>
       </w:r>
     </w:p>
     <w:p>

</xml_diff>